<commit_message>
extending the compiler to the rest of the language along with tests
</commit_message>
<xml_diff>
--- a/docs/GW-BASIC LLVM IR Generation and Optimization.docx
+++ b/docs/GW-BASIC LLVM IR Generation and Optimization.docx
@@ -3075,6 +3075,7 @@
     <w:p>
       <w:pPr>
         <w:pStyle w:val="FootnoteText"/>
+        <w:spacing w:before="0" w:after="0"/>
       </w:pPr>
       <w:r>
         <w:rPr>
@@ -3093,6 +3094,9 @@
           <w:t>https://github.com/sam-caldwell/csci-430</w:t>
         </w:r>
       </w:hyperlink>
+      <w:r>
+        <w:t xml:space="preserve"> (week2 branch)</w:t>
+      </w:r>
       <w:r>
         <w:t xml:space="preserve">. </w:t>
       </w:r>
@@ -6632,7 +6636,7 @@
 </file>
 
 <file path=customXml/itemProps4.xml><?xml version="1.0" encoding="utf-8"?>
-<ds:datastoreItem xmlns:ds="http://schemas.openxmlformats.org/officeDocument/2006/customXml" ds:itemID="{61095C61-B5DD-1949-972C-1E7310C943D6}">
+<ds:datastoreItem xmlns:ds="http://schemas.openxmlformats.org/officeDocument/2006/customXml" ds:itemID="{5635AFD6-3AD3-A443-BF22-9D5027EB0912}">
   <ds:schemaRefs>
     <ds:schemaRef ds:uri="http://schemas.openxmlformats.org/officeDocument/2006/bibliography"/>
   </ds:schemaRefs>

</xml_diff>